<commit_message>
Agregar matriz y evidencias finales
</commit_message>
<xml_diff>
--- a/docs/MatrizEvidencias_Veterinaria.docx
+++ b/docs/MatrizEvidencias_Veterinaria.docx
@@ -386,24 +386,29 @@
           </w:tcPr>
           <w:p>
             <w:pPr>
-              <w:spacing w:after="40"/>
+              <w:spacing w:after="0"/>
+            </w:pPr>
+            <w:r>
               <w:rPr>
-                <w:rFonts w:ascii="Arial" w:hAnsi="Arial" w:cs="Arial"/>
-                <w:sz w:val="20"/>
+                <w:sz w:val="16"/>
               </w:rPr>
-            </w:pPr>
+            </w:r>
             <w:hyperlink r:id="rId8">
               <w:r>
                 <w:rPr>
-                  <w:rFonts w:ascii="Arial" w:hAnsi="Arial" w:eastAsia="ＭＳ 明朝" w:cs="Arial" w:eastAsiaTheme="minorEastAsia"/>
-                  <w:color w:val="000000" w:themeColor="dk1"/>
-                  <w:sz w:val="20"/>
-                  <w:szCs w:val="22"/>
+                  <w:color w:val="0563C1"/>
                   <w:u w:val="single"/>
                 </w:rPr>
                 <w:t>Diagrama DER</w:t>
               </w:r>
             </w:hyperlink>
+            <w:r>
+              <w:rPr>
+                <w:sz w:val="16"/>
+              </w:rPr>
+              <w:br/>
+              <w:t>der.png</w:t>
+            </w:r>
           </w:p>
         </w:tc>
       </w:tr>
@@ -610,27 +615,28 @@
           </w:tcPr>
           <w:p>
             <w:pPr>
-              <w:spacing w:after="40"/>
-              <w:rPr>
-                <w:rFonts w:ascii="Arial" w:hAnsi="Arial" w:cs="Arial"/>
-                <w:sz w:val="20"/>
-              </w:rPr>
+              <w:spacing w:after="0"/>
             </w:pPr>
             <w:r>
               <w:rPr>
-                <w:rFonts w:ascii="Arial" w:hAnsi="Arial" w:eastAsia="ＭＳ 明朝" w:cs="Arial" w:eastAsiaTheme="minorEastAsia"/>
-                <w:sz w:val="18"/>
-                <w:szCs w:val="22"/>
+                <w:sz w:val="16"/>
               </w:rPr>
-              <w:t>Funcionalidad implementada y co</w:t>
             </w:r>
+            <w:hyperlink r:id="rId28">
+              <w:r>
+                <w:rPr>
+                  <w:color w:val="0563C1"/>
+                  <w:u w:val="single"/>
+                </w:rPr>
+                <w:t>Captura de sesión y rol</w:t>
+              </w:r>
+            </w:hyperlink>
             <w:r>
               <w:rPr>
-                <w:rFonts w:ascii="Arial" w:hAnsi="Arial" w:eastAsia="ＭＳ 明朝" w:cs="Arial" w:eastAsiaTheme="minorEastAsia"/>
-                <w:sz w:val="18"/>
-                <w:szCs w:val="22"/>
+                <w:sz w:val="16"/>
               </w:rPr>
-              <w:t>mprobada en la aplicación</w:t>
+              <w:br/>
+              <w:t>evidencias/02-login-roles-avatar.jpeg</w:t>
             </w:r>
           </w:p>
         </w:tc>
@@ -792,19 +798,28 @@
           </w:tcPr>
           <w:p>
             <w:pPr>
-              <w:spacing w:after="40"/>
-              <w:rPr>
-                <w:rFonts w:ascii="Arial" w:hAnsi="Arial" w:cs="Arial"/>
-                <w:sz w:val="20"/>
-              </w:rPr>
+              <w:spacing w:after="0"/>
             </w:pPr>
             <w:r>
               <w:rPr>
-                <w:rFonts w:ascii="Arial" w:hAnsi="Arial" w:eastAsia="ＭＳ 明朝" w:cs="Arial" w:eastAsiaTheme="minorEastAsia"/>
-                <w:sz w:val="18"/>
-                <w:szCs w:val="22"/>
+                <w:sz w:val="16"/>
               </w:rPr>
-              <w:t>Funcionalidad implementada y comprobada en la aplicación</w:t>
+            </w:r>
+            <w:hyperlink r:id="rId28">
+              <w:r>
+                <w:rPr>
+                  <w:color w:val="0563C1"/>
+                  <w:u w:val="single"/>
+                </w:rPr>
+                <w:t>Captura de avatar</w:t>
+              </w:r>
+            </w:hyperlink>
+            <w:r>
+              <w:rPr>
+                <w:sz w:val="16"/>
+              </w:rPr>
+              <w:br/>
+              <w:t>evidencias/02-login-roles-avatar.jpeg</w:t>
             </w:r>
           </w:p>
         </w:tc>
@@ -966,19 +981,28 @@
           </w:tcPr>
           <w:p>
             <w:pPr>
-              <w:spacing w:after="40"/>
-              <w:rPr>
-                <w:rFonts w:ascii="Arial" w:hAnsi="Arial" w:cs="Arial"/>
-                <w:sz w:val="20"/>
-              </w:rPr>
+              <w:spacing w:after="0"/>
             </w:pPr>
             <w:r>
               <w:rPr>
-                <w:rFonts w:ascii="Arial" w:hAnsi="Arial" w:eastAsia="ＭＳ 明朝" w:cs="Arial" w:eastAsiaTheme="minorEastAsia"/>
-                <w:sz w:val="18"/>
-                <w:szCs w:val="22"/>
+                <w:sz w:val="16"/>
               </w:rPr>
-              <w:t>Funcionalidad de carga y consulta de archivos clínicos comprobada</w:t>
+            </w:r>
+            <w:hyperlink r:id="rId29">
+              <w:r>
+                <w:rPr>
+                  <w:color w:val="0563C1"/>
+                  <w:u w:val="single"/>
+                </w:rPr>
+                <w:t>Video de carga y consulta</w:t>
+              </w:r>
+            </w:hyperlink>
+            <w:r>
+              <w:rPr>
+                <w:sz w:val="16"/>
+              </w:rPr>
+              <w:br/>
+              <w:t>evidencias/04-manejo-archivos.mp4</w:t>
             </w:r>
           </w:p>
         </w:tc>
@@ -1137,27 +1161,28 @@
           </w:tcPr>
           <w:p>
             <w:pPr>
-              <w:spacing w:after="40"/>
-              <w:rPr>
-                <w:rFonts w:ascii="Arial" w:hAnsi="Arial" w:cs="Arial"/>
-                <w:sz w:val="20"/>
-              </w:rPr>
+              <w:spacing w:after="0"/>
             </w:pPr>
             <w:r>
               <w:rPr>
-                <w:rFonts w:ascii="Arial" w:hAnsi="Arial" w:eastAsia="ＭＳ 明朝" w:cs="Arial" w:eastAsiaTheme="minorEastAsia"/>
-                <w:sz w:val="18"/>
-                <w:szCs w:val="22"/>
+                <w:sz w:val="16"/>
               </w:rPr>
-              <w:t xml:space="preserve">CRUD </w:t>
             </w:r>
+            <w:hyperlink r:id="rId30">
+              <w:r>
+                <w:rPr>
+                  <w:color w:val="0563C1"/>
+                  <w:u w:val="single"/>
+                </w:rPr>
+                <w:t>Video CRUD Vue.js</w:t>
+              </w:r>
+            </w:hyperlink>
             <w:r>
               <w:rPr>
-                <w:rFonts w:ascii="Arial" w:hAnsi="Arial" w:eastAsia="ＭＳ 明朝" w:cs="Arial" w:eastAsiaTheme="minorEastAsia"/>
-                <w:sz w:val="18"/>
-                <w:szCs w:val="22"/>
+                <w:sz w:val="16"/>
               </w:rPr>
-              <w:t>de especies comprobado</w:t>
+              <w:br/>
+              <w:t>evidencias/05-crud-vue.mp4</w:t>
             </w:r>
           </w:p>
         </w:tc>
@@ -1328,19 +1353,28 @@
           </w:tcPr>
           <w:p>
             <w:pPr>
-              <w:spacing w:after="40"/>
-              <w:rPr>
-                <w:rFonts w:ascii="Arial" w:hAnsi="Arial" w:cs="Arial"/>
-                <w:sz w:val="20"/>
-              </w:rPr>
+              <w:spacing w:after="0"/>
             </w:pPr>
             <w:r>
               <w:rPr>
-                <w:rFonts w:ascii="Arial" w:hAnsi="Arial" w:eastAsia="ＭＳ 明朝" w:cs="Arial" w:eastAsiaTheme="minorEastAsia"/>
-                <w:sz w:val="18"/>
-                <w:szCs w:val="22"/>
+                <w:sz w:val="16"/>
               </w:rPr>
-              <w:t>Paginación comprobada mediante las pruebas realizadas</w:t>
+            </w:r>
+            <w:hyperlink r:id="rId31">
+              <w:r>
+                <w:rPr>
+                  <w:color w:val="0563C1"/>
+                  <w:u w:val="single"/>
+                </w:rPr>
+                <w:t>Captura de paginación</w:t>
+              </w:r>
+            </w:hyperlink>
+            <w:r>
+              <w:rPr>
+                <w:sz w:val="16"/>
+              </w:rPr>
+              <w:br/>
+              <w:t>evidencias/06-paginacion.jpeg</w:t>
             </w:r>
           </w:p>
         </w:tc>
@@ -1508,19 +1542,28 @@
           </w:tcPr>
           <w:p>
             <w:pPr>
-              <w:spacing w:after="40"/>
-              <w:rPr>
-                <w:rFonts w:ascii="Arial" w:hAnsi="Arial" w:cs="Arial"/>
-                <w:sz w:val="20"/>
-              </w:rPr>
+              <w:spacing w:after="0"/>
             </w:pPr>
             <w:r>
               <w:rPr>
-                <w:rFonts w:ascii="Arial" w:hAnsi="Arial" w:eastAsia="ＭＳ 明朝" w:cs="Arial" w:eastAsiaTheme="minorEastAsia"/>
-                <w:sz w:val="18"/>
-                <w:szCs w:val="22"/>
+                <w:sz w:val="16"/>
               </w:rPr>
-              <w:t>Búsquedas asíncronas comprobadas en Clientes, Turnos y Consultas</w:t>
+            </w:r>
+            <w:hyperlink r:id="rId32">
+              <w:r>
+                <w:rPr>
+                  <w:color w:val="0563C1"/>
+                  <w:u w:val="single"/>
+                </w:rPr>
+                <w:t>Video búsqueda AJAX</w:t>
+              </w:r>
+            </w:hyperlink>
+            <w:r>
+              <w:rPr>
+                <w:sz w:val="16"/>
+              </w:rPr>
+              <w:br/>
+              <w:t>evidencias/07-busqueda-ajax.mp4</w:t>
             </w:r>
           </w:p>
         </w:tc>
@@ -1703,19 +1746,17 @@
           </w:tcPr>
           <w:p>
             <w:pPr>
-              <w:spacing w:after="40"/>
+              <w:spacing w:after="0"/>
+            </w:pPr>
+            <w:r>
               <w:rPr>
-                <w:rFonts w:ascii="Arial" w:hAnsi="Arial" w:cs="Arial"/>
-                <w:sz w:val="20"/>
+                <w:sz w:val="16"/>
               </w:rPr>
-            </w:pPr>
+            </w:r>
             <w:hyperlink r:id="rId24">
               <w:r>
                 <w:rPr>
-                  <w:rFonts w:ascii="Arial" w:hAnsi="Arial" w:eastAsia="ＭＳ 明朝" w:cs="Arial" w:eastAsiaTheme="minorEastAsia"/>
-                  <w:color w:val="000000" w:themeColor="dk1"/>
-                  <w:sz w:val="20"/>
-                  <w:szCs w:val="22"/>
+                  <w:color w:val="0563C1"/>
                   <w:u w:val="single"/>
                 </w:rPr>
                 <w:t>Colección Postman</w:t>
@@ -1723,23 +1764,17 @@
             </w:hyperlink>
             <w:r>
               <w:rPr>
-                <w:rFonts w:ascii="Arial" w:hAnsi="Arial" w:eastAsia="ＭＳ 明朝" w:cs="Arial" w:eastAsiaTheme="minorEastAsia"/>
-                <w:color w:val="000000" w:themeColor="dk1"/>
-                <w:sz w:val="18"/>
-                <w:szCs w:val="22"/>
+                <w:sz w:val="16"/>
               </w:rPr>
-              <w:t xml:space="preserve"> y </w:t>
+              <w:t xml:space="preserve"> · </w:t>
             </w:r>
-            <w:hyperlink r:id="rId25">
+            <w:hyperlink r:id="rId33">
               <w:r>
                 <w:rPr>
-                  <w:rFonts w:ascii="Arial" w:hAnsi="Arial" w:eastAsia="ＭＳ 明朝" w:cs="Arial" w:eastAsiaTheme="minorEastAsia"/>
-                  <w:color w:val="000000" w:themeColor="dk1"/>
-                  <w:sz w:val="20"/>
-                  <w:szCs w:val="22"/>
+                  <w:color w:val="0563C1"/>
                   <w:u w:val="single"/>
                 </w:rPr>
-                <w:t>evidencias Postman</w:t>
+                <w:t>Evidencias Postman</w:t>
               </w:r>
             </w:hyperlink>
           </w:p>

</xml_diff>